<commit_message>
Update multiple language resources and metadata for 2026-05-07 release
</commit_message>
<xml_diff>
--- a/eng/docx/019.content.docx
+++ b/eng/docx/019.content.docx
@@ -310,7 +310,7 @@
         <w:rPr>
           <w:lang w:val="en_US" w:bidi="en_US"/>
         </w:rPr>
-        <w:t>Water Jar</w:t>
+        <w:t>Wheat Ready For Harvest</w:t>
       </w:r>
       <w:r>
         <w:rPr>
@@ -345,7 +345,7 @@
         <w:rPr>
           <w:lang w:val="en_US" w:bidi="en_US"/>
         </w:rPr>
-        <w:t xml:space="preserve"> (63 seconds)</w:t>
+        <w:t xml:space="preserve"> (79 seconds)</w:t>
       </w:r>
     </w:p>
     <w:p>
@@ -430,7 +430,7 @@
         <w:rPr>
           <w:lang w:val="en_US" w:bidi="en_US"/>
         </w:rPr>
-        <w:t>Wheat Ready For Harvest</w:t>
+        <w:t>Wheat with Heads of Grain</w:t>
       </w:r>
       <w:r>
         <w:rPr>
@@ -465,7 +465,7 @@
         <w:rPr>
           <w:lang w:val="en_US" w:bidi="en_US"/>
         </w:rPr>
-        <w:t xml:space="preserve"> (79 seconds)</w:t>
+        <w:t xml:space="preserve"> (131 seconds)</w:t>
       </w:r>
     </w:p>
     <w:p>
@@ -550,7 +550,7 @@
         <w:rPr>
           <w:lang w:val="en_US" w:bidi="en_US"/>
         </w:rPr>
-        <w:t>Wheat with Heads of Grain</w:t>
+        <w:t>White Robe</w:t>
       </w:r>
       <w:r>
         <w:rPr>
@@ -585,7 +585,7 @@
         <w:rPr>
           <w:lang w:val="en_US" w:bidi="en_US"/>
         </w:rPr>
-        <w:t xml:space="preserve"> (131 seconds)</w:t>
+        <w:t xml:space="preserve"> (76 seconds)</w:t>
       </w:r>
     </w:p>
     <w:p>
@@ -670,7 +670,7 @@
         <w:rPr>
           <w:lang w:val="en_US" w:bidi="en_US"/>
         </w:rPr>
-        <w:t>White Robe</w:t>
+        <w:t>Wilderness or Desert</w:t>
       </w:r>
       <w:r>
         <w:rPr>
@@ -705,7 +705,7 @@
         <w:rPr>
           <w:lang w:val="en_US" w:bidi="en_US"/>
         </w:rPr>
-        <w:t xml:space="preserve"> (76 seconds)</w:t>
+        <w:t xml:space="preserve"> (55 seconds)</w:t>
       </w:r>
     </w:p>
     <w:p>
@@ -790,7 +790,7 @@
         <w:rPr>
           <w:lang w:val="en_US" w:bidi="en_US"/>
         </w:rPr>
-        <w:t>Wilderness or Desert</w:t>
+        <w:t>Wineskins</w:t>
       </w:r>
       <w:r>
         <w:rPr>
@@ -825,7 +825,7 @@
         <w:rPr>
           <w:lang w:val="en_US" w:bidi="en_US"/>
         </w:rPr>
-        <w:t xml:space="preserve"> (55 seconds)</w:t>
+        <w:t xml:space="preserve"> (59 seconds)</w:t>
       </w:r>
     </w:p>
     <w:p>
@@ -910,7 +910,7 @@
         <w:rPr>
           <w:lang w:val="en_US" w:bidi="en_US"/>
         </w:rPr>
-        <w:t>Wineskins</w:t>
+        <w:t>Winnowing Fork</w:t>
       </w:r>
       <w:r>
         <w:rPr>
@@ -945,7 +945,7 @@
         <w:rPr>
           <w:lang w:val="en_US" w:bidi="en_US"/>
         </w:rPr>
-        <w:t xml:space="preserve"> (59 seconds)</w:t>
+        <w:t xml:space="preserve"> (75 seconds)</w:t>
       </w:r>
     </w:p>
     <w:p>
@@ -1030,7 +1030,7 @@
         <w:rPr>
           <w:lang w:val="en_US" w:bidi="en_US"/>
         </w:rPr>
-        <w:t>Winnowing Fork</w:t>
+        <w:t>Writing Tablet</w:t>
       </w:r>
       <w:r>
         <w:rPr>
@@ -1065,7 +1065,7 @@
         <w:rPr>
           <w:lang w:val="en_US" w:bidi="en_US"/>
         </w:rPr>
-        <w:t xml:space="preserve"> (75 seconds)</w:t>
+        <w:t xml:space="preserve"> (72 seconds)</w:t>
       </w:r>
     </w:p>
     <w:p>
@@ -1112,126 +1112,6 @@
         </w:rPr>
       </w:r>
       <w:hyperlink r:id="rId28">
-        <w:r>
-          <w:rPr>
-            <w:lang w:val="en_US" w:bidi="en_US"/>
-          </w:rPr>
-          <w:rPr>
-            <w:color w:val="0000EE"/>
-            <w:u w:val="single"/>
-          </w:rPr>
-          <w:t>link</w:t>
-        </w:r>
-      </w:hyperlink>
-      <w:r>
-        <w:rPr>
-          <w:lang w:val="en_US" w:bidi="en_US"/>
-        </w:rPr>
-      </w:r>
-      <w:r>
-        <w:rPr>
-          <w:lang w:val="en_US" w:bidi="en_US"/>
-        </w:rPr>
-      </w:r>
-    </w:p>
-    <w:p>
-      <w:pPr/>
-      <w:r>
-        <w:rPr>
-          <w:lang w:val="en_US" w:bidi="en_US"/>
-        </w:rPr>
-      </w:r>
-    </w:p>
-    <w:p>
-      <w:pPr>
-        <w:pStyle w:val="Heading2"/>
-      </w:pPr>
-      <w:r>
-        <w:rPr>
-          <w:lang w:val="en_US" w:bidi="en_US"/>
-        </w:rPr>
-        <w:t>Writing Tablet</w:t>
-      </w:r>
-      <w:r>
-        <w:rPr>
-          <w:lang w:val="en_US" w:bidi="en_US"/>
-        </w:rPr>
-      </w:r>
-    </w:p>
-    <w:p>
-      <w:pPr>
-        <w:pStyle w:val="Heading4"/>
-      </w:pPr>
-      <w:r>
-        <w:rPr>
-          <w:lang w:val="en_US" w:bidi="en_US"/>
-        </w:rPr>
-        <w:t>Video Content</w:t>
-      </w:r>
-      <w:r>
-        <w:rPr>
-          <w:lang w:val="en_US" w:bidi="en_US"/>
-        </w:rPr>
-      </w:r>
-    </w:p>
-    <w:p>
-      <w:pPr/>
-      <w:r>
-        <w:rPr>
-          <w:lang w:val="en_US" w:bidi="en_US"/>
-        </w:rPr>
-      </w:r>
-      <w:r>
-        <w:rPr>
-          <w:lang w:val="en_US" w:bidi="en_US"/>
-        </w:rPr>
-        <w:t xml:space="preserve"> (72 seconds)</w:t>
-      </w:r>
-    </w:p>
-    <w:p>
-      <w:r>
-        <w:drawing>
-          <wp:inline xmlns:a="http://schemas.openxmlformats.org/drawingml/2006/main" xmlns:pic="http://schemas.openxmlformats.org/drawingml/2006/picture">
-            <wp:extent cx="6096000" cy="3429000"/>
-            <wp:docPr id="9" name="Picture 9"/>
-            <wp:cNvGraphicFramePr>
-              <a:graphicFrameLocks noChangeAspect="1"/>
-            </wp:cNvGraphicFramePr>
-            <a:graphic>
-              <a:graphicData uri="http://schemas.openxmlformats.org/drawingml/2006/picture">
-                <pic:pic>
-                  <pic:nvPicPr>
-                    <pic:cNvPr id="0" name="image.jpg"/>
-                    <pic:cNvPicPr/>
-                  </pic:nvPicPr>
-                  <pic:blipFill>
-                    <a:blip r:embed="rId29"/>
-                    <a:stretch>
-                      <a:fillRect/>
-                    </a:stretch>
-                  </pic:blipFill>
-                  <pic:spPr>
-                    <a:xfrm>
-                      <a:off x="0" y="0"/>
-                      <a:ext cx="6096000" cy="3429000"/>
-                    </a:xfrm>
-                    <a:prstGeom prst="rect"/>
-                  </pic:spPr>
-                </pic:pic>
-              </a:graphicData>
-            </a:graphic>
-          </wp:inline>
-        </w:drawing>
-      </w:r>
-    </w:p>
-    <w:p>
-      <w:pPr/>
-      <w:r>
-        <w:rPr>
-          <w:lang w:val="en_US" w:bidi="en_US"/>
-        </w:rPr>
-      </w:r>
-      <w:hyperlink r:id="rId30">
         <w:r>
           <w:rPr>
             <w:lang w:val="en_US" w:bidi="en_US"/>

</xml_diff>